<commit_message>
Connexion entre Zombie, ZombieType
</commit_message>
<xml_diff>
--- a/S04_Lab_Instructions.docx
+++ b/S04_Lab_Instructions.docx
@@ -3346,21 +3346,7 @@
         <w:rPr>
           <w:lang w:val="en-US"/>
         </w:rPr>
-        <w:t xml:space="preserve"> </w:t>
-      </w:r>
-      <w:proofErr w:type="spellStart"/>
-      <w:r>
-        <w:rPr>
-          <w:lang w:val="en-US"/>
-        </w:rPr>
-        <w:t>DbContext</w:t>
-      </w:r>
-      <w:proofErr w:type="spellEnd"/>
-      <w:r>
-        <w:rPr>
-          <w:lang w:val="en-US"/>
-        </w:rPr>
-        <w:t xml:space="preserve"> DI</w:t>
+        <w:t xml:space="preserve"> DbContext DI</w:t>
       </w:r>
     </w:p>
     <w:p>
@@ -5062,7 +5048,15 @@
         <w:spacing w:before="0" w:after="160" w:line="259" w:lineRule="auto"/>
       </w:pPr>
       <w:r>
-        <w:t xml:space="preserve">Et si vous avez ce message à la place, c’est que vous avez mis les annotations sur ZombieType et non </w:t>
+        <w:t xml:space="preserve">Et si vous avez ce message à la place, c’est que vous avez mis les annotations sur </w:t>
+      </w:r>
+      <w:proofErr w:type="spellStart"/>
+      <w:r>
+        <w:t>ZombieType</w:t>
+      </w:r>
+      <w:proofErr w:type="spellEnd"/>
+      <w:r>
+        <w:t xml:space="preserve"> et non </w:t>
       </w:r>
       <w:proofErr w:type="spellStart"/>
       <w:r>
@@ -5731,8 +5725,16 @@
         <w:t>2</w:t>
       </w:r>
       <w:r>
-        <w:t xml:space="preserve"> et</w:t>
-      </w:r>
+        <w:t xml:space="preserve"> </w:t>
+      </w:r>
+      <w:proofErr w:type="spellStart"/>
+      <w:r>
+        <w:t>et</w:t>
+      </w:r>
+      <w:r>
+        <w:t>publc</w:t>
+      </w:r>
+      <w:proofErr w:type="spellEnd"/>
       <w:r>
         <w:t xml:space="preserve"> 5</w:t>
       </w:r>
@@ -9779,20 +9781,38 @@
           <w:bCs/>
         </w:rPr>
       </w:pPr>
+      <w:proofErr w:type="spellStart"/>
       <w:r>
         <w:rPr>
           <w:b/>
           <w:bCs/>
         </w:rPr>
         <w:lastRenderedPageBreak/>
-        <w:t xml:space="preserve">ZombieType </w:t>
-      </w:r>
+        <w:t>ZombieType</w:t>
+      </w:r>
+      <w:proofErr w:type="spellEnd"/>
       <w:r>
         <w:rPr>
           <w:b/>
           <w:bCs/>
         </w:rPr>
-        <w:t xml:space="preserve">Views </w:t>
+        <w:t xml:space="preserve"> </w:t>
+      </w:r>
+      <w:proofErr w:type="spellStart"/>
+      <w:r>
+        <w:rPr>
+          <w:b/>
+          <w:bCs/>
+        </w:rPr>
+        <w:t>Views</w:t>
+      </w:r>
+      <w:proofErr w:type="spellEnd"/>
+      <w:r>
+        <w:rPr>
+          <w:b/>
+          <w:bCs/>
+        </w:rPr>
+        <w:t xml:space="preserve"> </w:t>
       </w:r>
       <w:proofErr w:type="spellStart"/>
       <w:r>
@@ -9820,7 +9840,15 @@
         </w:numPr>
       </w:pPr>
       <w:r>
-        <w:t xml:space="preserve">Ouvrez la View </w:t>
+        <w:t xml:space="preserve">Ouvrez la </w:t>
+      </w:r>
+      <w:proofErr w:type="spellStart"/>
+      <w:r>
+        <w:t>View</w:t>
+      </w:r>
+      <w:proofErr w:type="spellEnd"/>
+      <w:r>
+        <w:t xml:space="preserve"> </w:t>
       </w:r>
       <w:proofErr w:type="spellStart"/>
       <w:r>
@@ -12138,7 +12166,15 @@
         <w:t xml:space="preserve">En cas de doute, référez-vous </w:t>
       </w:r>
       <w:r>
-        <w:t xml:space="preserve">au ZombieType ou au </w:t>
+        <w:t xml:space="preserve">au </w:t>
+      </w:r>
+      <w:proofErr w:type="spellStart"/>
+      <w:r>
+        <w:t>ZombieType</w:t>
+      </w:r>
+      <w:proofErr w:type="spellEnd"/>
+      <w:r>
+        <w:t xml:space="preserve"> ou au </w:t>
       </w:r>
       <w:proofErr w:type="spellStart"/>
       <w:r>
@@ -12422,6 +12458,7 @@
           <w:color w:val="000000"/>
           <w:sz w:val="19"/>
           <w:szCs w:val="19"/>
+          <w:lang w:val="en-CA"/>
         </w:rPr>
       </w:pPr>
       <w:r>
@@ -12433,15 +12470,68 @@
         </w:rPr>
         <w:t xml:space="preserve">    </w:t>
       </w:r>
+      <w:r>
+        <w:rPr>
+          <w:rFonts w:ascii="Cascadia Mono" w:hAnsi="Cascadia Mono" w:cs="Cascadia Mono"/>
+          <w:color w:val="0000FF"/>
+          <w:sz w:val="19"/>
+          <w:szCs w:val="19"/>
+          <w:lang w:val="en-CA"/>
+        </w:rPr>
+        <w:t>public</w:t>
+      </w:r>
+      <w:r>
+        <w:rPr>
+          <w:rFonts w:ascii="Cascadia Mono" w:hAnsi="Cascadia Mono" w:cs="Cascadia Mono"/>
+          <w:color w:val="000000"/>
+          <w:sz w:val="19"/>
+          <w:szCs w:val="19"/>
+          <w:lang w:val="en-CA"/>
+        </w:rPr>
+        <w:t xml:space="preserve"> Zombie </w:t>
+      </w:r>
+      <w:proofErr w:type="spellStart"/>
+      <w:r>
+        <w:rPr>
+          <w:rFonts w:ascii="Cascadia Mono" w:hAnsi="Cascadia Mono" w:cs="Cascadia Mono"/>
+          <w:color w:val="000000"/>
+          <w:sz w:val="19"/>
+          <w:szCs w:val="19"/>
+          <w:lang w:val="en-CA"/>
+        </w:rPr>
+        <w:t>Zombie</w:t>
+      </w:r>
+      <w:proofErr w:type="spellEnd"/>
+      <w:r>
+        <w:rPr>
+          <w:rFonts w:ascii="Cascadia Mono" w:hAnsi="Cascadia Mono" w:cs="Cascadia Mono"/>
+          <w:color w:val="000000"/>
+          <w:sz w:val="19"/>
+          <w:szCs w:val="19"/>
+          <w:lang w:val="en-CA"/>
+        </w:rPr>
+        <w:t xml:space="preserve"> </w:t>
+      </w:r>
       <w:proofErr w:type="gramStart"/>
       <w:r>
         <w:rPr>
           <w:rFonts w:ascii="Cascadia Mono" w:hAnsi="Cascadia Mono" w:cs="Cascadia Mono"/>
+          <w:color w:val="000000"/>
+          <w:sz w:val="19"/>
+          <w:szCs w:val="19"/>
+          <w:lang w:val="en-CA"/>
+        </w:rPr>
+        <w:t xml:space="preserve">{ </w:t>
+      </w:r>
+      <w:r>
+        <w:rPr>
+          <w:rFonts w:ascii="Cascadia Mono" w:hAnsi="Cascadia Mono" w:cs="Cascadia Mono"/>
           <w:color w:val="0000FF"/>
           <w:sz w:val="19"/>
           <w:szCs w:val="19"/>
-        </w:rPr>
-        <w:t>public</w:t>
+          <w:lang w:val="en-CA"/>
+        </w:rPr>
+        <w:t>get</w:t>
       </w:r>
       <w:proofErr w:type="gramEnd"/>
       <w:r>
@@ -12450,28 +12540,19 @@
           <w:color w:val="000000"/>
           <w:sz w:val="19"/>
           <w:szCs w:val="19"/>
-        </w:rPr>
-        <w:t xml:space="preserve"> Zombie </w:t>
-      </w:r>
-      <w:proofErr w:type="spellStart"/>
-      <w:r>
-        <w:rPr>
-          <w:rFonts w:ascii="Cascadia Mono" w:hAnsi="Cascadia Mono" w:cs="Cascadia Mono"/>
-          <w:color w:val="000000"/>
-          <w:sz w:val="19"/>
-          <w:szCs w:val="19"/>
-        </w:rPr>
-        <w:t>Zombie</w:t>
-      </w:r>
-      <w:proofErr w:type="spellEnd"/>
-      <w:r>
-        <w:rPr>
-          <w:rFonts w:ascii="Cascadia Mono" w:hAnsi="Cascadia Mono" w:cs="Cascadia Mono"/>
-          <w:color w:val="000000"/>
-          <w:sz w:val="19"/>
-          <w:szCs w:val="19"/>
-        </w:rPr>
-        <w:t xml:space="preserve"> </w:t>
+          <w:lang w:val="en-CA"/>
+        </w:rPr>
+        <w:t xml:space="preserve">; </w:t>
+      </w:r>
+      <w:r>
+        <w:rPr>
+          <w:rFonts w:ascii="Cascadia Mono" w:hAnsi="Cascadia Mono" w:cs="Cascadia Mono"/>
+          <w:color w:val="0000FF"/>
+          <w:sz w:val="19"/>
+          <w:szCs w:val="19"/>
+          <w:lang w:val="en-CA"/>
+        </w:rPr>
+        <w:t>set</w:t>
       </w:r>
       <w:proofErr w:type="gramStart"/>
       <w:r>
@@ -12480,46 +12561,7 @@
           <w:color w:val="000000"/>
           <w:sz w:val="19"/>
           <w:szCs w:val="19"/>
-        </w:rPr>
-        <w:t xml:space="preserve">{ </w:t>
-      </w:r>
-      <w:proofErr w:type="spellStart"/>
-      <w:r>
-        <w:rPr>
-          <w:rFonts w:ascii="Cascadia Mono" w:hAnsi="Cascadia Mono" w:cs="Cascadia Mono"/>
-          <w:color w:val="0000FF"/>
-          <w:sz w:val="19"/>
-          <w:szCs w:val="19"/>
-        </w:rPr>
-        <w:t>get</w:t>
-      </w:r>
-      <w:proofErr w:type="spellEnd"/>
-      <w:proofErr w:type="gramEnd"/>
-      <w:r>
-        <w:rPr>
-          <w:rFonts w:ascii="Cascadia Mono" w:hAnsi="Cascadia Mono" w:cs="Cascadia Mono"/>
-          <w:color w:val="000000"/>
-          <w:sz w:val="19"/>
-          <w:szCs w:val="19"/>
-        </w:rPr>
-        <w:t xml:space="preserve">; </w:t>
-      </w:r>
-      <w:r>
-        <w:rPr>
-          <w:rFonts w:ascii="Cascadia Mono" w:hAnsi="Cascadia Mono" w:cs="Cascadia Mono"/>
-          <w:color w:val="0000FF"/>
-          <w:sz w:val="19"/>
-          <w:szCs w:val="19"/>
-        </w:rPr>
-        <w:t>set</w:t>
-      </w:r>
-      <w:proofErr w:type="gramStart"/>
-      <w:r>
-        <w:rPr>
-          <w:rFonts w:ascii="Cascadia Mono" w:hAnsi="Cascadia Mono" w:cs="Cascadia Mono"/>
-          <w:color w:val="000000"/>
-          <w:sz w:val="19"/>
-          <w:szCs w:val="19"/>
+          <w:lang w:val="en-CA"/>
         </w:rPr>
         <w:t>; }</w:t>
       </w:r>
@@ -12544,6 +12586,7 @@
           <w:color w:val="000000"/>
           <w:sz w:val="19"/>
           <w:szCs w:val="19"/>
+          <w:lang w:val="en-CA"/>
         </w:rPr>
       </w:pPr>
     </w:p>
@@ -12566,14 +12609,16 @@
           <w:color w:val="000000"/>
           <w:sz w:val="19"/>
           <w:szCs w:val="19"/>
-        </w:rPr>
-      </w:pPr>
-      <w:r>
-        <w:rPr>
-          <w:rFonts w:ascii="Cascadia Mono" w:hAnsi="Cascadia Mono" w:cs="Cascadia Mono"/>
-          <w:color w:val="000000"/>
-          <w:sz w:val="19"/>
-          <w:szCs w:val="19"/>
+          <w:lang w:val="en-CA"/>
+        </w:rPr>
+      </w:pPr>
+      <w:r>
+        <w:rPr>
+          <w:rFonts w:ascii="Cascadia Mono" w:hAnsi="Cascadia Mono" w:cs="Cascadia Mono"/>
+          <w:color w:val="000000"/>
+          <w:sz w:val="19"/>
+          <w:szCs w:val="19"/>
+          <w:lang w:val="en-CA"/>
         </w:rPr>
         <w:t xml:space="preserve">    </w:t>
       </w:r>
@@ -13362,7 +13407,29 @@
           <w:szCs w:val="19"/>
           <w:highlight w:val="cyan"/>
         </w:rPr>
-        <w:t xml:space="preserve"> View(</w:t>
+        <w:t xml:space="preserve"> </w:t>
+      </w:r>
+      <w:proofErr w:type="spellStart"/>
+      <w:r>
+        <w:rPr>
+          <w:rFonts w:ascii="Cascadia Mono" w:hAnsi="Cascadia Mono" w:cs="Cascadia Mono"/>
+          <w:color w:val="000000"/>
+          <w:sz w:val="19"/>
+          <w:szCs w:val="19"/>
+          <w:highlight w:val="cyan"/>
+        </w:rPr>
+        <w:t>View</w:t>
+      </w:r>
+      <w:proofErr w:type="spellEnd"/>
+      <w:r>
+        <w:rPr>
+          <w:rFonts w:ascii="Cascadia Mono" w:hAnsi="Cascadia Mono" w:cs="Cascadia Mono"/>
+          <w:color w:val="000000"/>
+          <w:sz w:val="19"/>
+          <w:szCs w:val="19"/>
+          <w:highlight w:val="cyan"/>
+        </w:rPr>
+        <w:t>(</w:t>
       </w:r>
       <w:proofErr w:type="spellStart"/>
       <w:r>
@@ -14135,27 +14202,7 @@
           <w:sz w:val="19"/>
           <w:szCs w:val="19"/>
         </w:rPr>
-        <w:t xml:space="preserve"> </w:t>
-      </w:r>
-      <w:proofErr w:type="spellStart"/>
-      <w:r>
-        <w:rPr>
-          <w:rFonts w:ascii="Cascadia Mono" w:hAnsi="Cascadia Mono" w:cs="Cascadia Mono"/>
-          <w:color w:val="A31515"/>
-          <w:sz w:val="19"/>
-          <w:szCs w:val="19"/>
-        </w:rPr>
-        <w:t>added</w:t>
-      </w:r>
-      <w:proofErr w:type="spellEnd"/>
-      <w:r>
-        <w:rPr>
-          <w:rFonts w:ascii="Cascadia Mono" w:hAnsi="Cascadia Mono" w:cs="Cascadia Mono"/>
-          <w:color w:val="A31515"/>
-          <w:sz w:val="19"/>
-          <w:szCs w:val="19"/>
-        </w:rPr>
-        <w:t>"</w:t>
+        <w:t xml:space="preserve"> added"</w:t>
       </w:r>
       <w:r>
         <w:rPr>
@@ -14466,7 +14513,29 @@
           <w:szCs w:val="19"/>
           <w:highlight w:val="magenta"/>
         </w:rPr>
-        <w:t xml:space="preserve">    ZombieType </w:t>
+        <w:t xml:space="preserve">    </w:t>
+      </w:r>
+      <w:proofErr w:type="spellStart"/>
+      <w:r>
+        <w:rPr>
+          <w:rFonts w:ascii="Cascadia Mono" w:hAnsi="Cascadia Mono" w:cs="Cascadia Mono"/>
+          <w:color w:val="000000"/>
+          <w:sz w:val="19"/>
+          <w:szCs w:val="19"/>
+          <w:highlight w:val="magenta"/>
+        </w:rPr>
+        <w:t>ZombieType</w:t>
+      </w:r>
+      <w:proofErr w:type="spellEnd"/>
+      <w:r>
+        <w:rPr>
+          <w:rFonts w:ascii="Cascadia Mono" w:hAnsi="Cascadia Mono" w:cs="Cascadia Mono"/>
+          <w:color w:val="000000"/>
+          <w:sz w:val="19"/>
+          <w:szCs w:val="19"/>
+          <w:highlight w:val="magenta"/>
+        </w:rPr>
+        <w:t xml:space="preserve"> </w:t>
       </w:r>
       <w:proofErr w:type="spellStart"/>
       <w:r>
@@ -15064,6 +15133,7 @@
         </w:rPr>
         <w:t xml:space="preserve"> </w:t>
       </w:r>
+      <w:proofErr w:type="spellStart"/>
       <w:proofErr w:type="gramStart"/>
       <w:r>
         <w:rPr>
@@ -15072,7 +15142,17 @@
           <w:sz w:val="19"/>
           <w:szCs w:val="19"/>
         </w:rPr>
-        <w:t>View(</w:t>
+        <w:t>View</w:t>
+      </w:r>
+      <w:proofErr w:type="spellEnd"/>
+      <w:r>
+        <w:rPr>
+          <w:rFonts w:ascii="Cascadia Mono" w:hAnsi="Cascadia Mono" w:cs="Cascadia Mono"/>
+          <w:color w:val="000000"/>
+          <w:sz w:val="19"/>
+          <w:szCs w:val="19"/>
+        </w:rPr>
+        <w:t>(</w:t>
       </w:r>
       <w:proofErr w:type="gramEnd"/>
       <w:r>
@@ -24526,6 +24606,7 @@
   <w:style w:type="character" w:default="1" w:styleId="Policepardfaut">
     <w:name w:val="Default Paragraph Font"/>
     <w:uiPriority w:val="1"/>
+    <w:semiHidden/>
     <w:unhideWhenUsed/>
   </w:style>
   <w:style w:type="table" w:default="1" w:styleId="TableauNormal">
@@ -25488,15 +25569,6 @@
 </file>
 
 <file path=customXml/item1.xml><?xml version="1.0" encoding="utf-8"?>
-<?mso-contentType ?>
-<FormTemplates xmlns="http://schemas.microsoft.com/sharepoint/v3/contenttype/forms">
-  <Display>DocumentLibraryForm</Display>
-  <Edit>DocumentLibraryForm</Edit>
-  <New>DocumentLibraryForm</New>
-</FormTemplates>
-</file>
-
-<file path=customXml/item2.xml><?xml version="1.0" encoding="utf-8"?>
 <ct:contentTypeSchema xmlns:ct="http://schemas.microsoft.com/office/2006/metadata/contentType" xmlns:ma="http://schemas.microsoft.com/office/2006/metadata/properties/metaAttributes" ct:_="" ma:_="" ma:contentTypeName="Document" ma:contentTypeID="0x010100354AEAE9FD62D747A26A546E5B1B5735" ma:contentTypeVersion="7" ma:contentTypeDescription="Crée un document." ma:contentTypeScope="" ma:versionID="43b763fe9aa20b7a2976a5e019d82dbf">
   <xsd:schema xmlns:xsd="http://www.w3.org/2001/XMLSchema" xmlns:xs="http://www.w3.org/2001/XMLSchema" xmlns:p="http://schemas.microsoft.com/office/2006/metadata/properties" xmlns:ns2="071933db-0376-4694-9786-b56cb37c4ec2" targetNamespace="http://schemas.microsoft.com/office/2006/metadata/properties" ma:root="true" ma:fieldsID="d5c90ae6c1ec6ed317c9f5feddaf7a33" ns2:_="">
     <xsd:import namespace="071933db-0376-4694-9786-b56cb37c4ec2"/>
@@ -25660,6 +25732,15 @@
 </ct:contentTypeSchema>
 </file>
 
+<file path=customXml/item2.xml><?xml version="1.0" encoding="utf-8"?>
+<?mso-contentType ?>
+<FormTemplates xmlns="http://schemas.microsoft.com/sharepoint/v3/contenttype/forms">
+  <Display>DocumentLibraryForm</Display>
+  <Edit>DocumentLibraryForm</Edit>
+  <New>DocumentLibraryForm</New>
+</FormTemplates>
+</file>
+
 <file path=customXml/item3.xml><?xml version="1.0" encoding="utf-8"?>
 <p:properties xmlns:p="http://schemas.microsoft.com/office/2006/metadata/properties" xmlns:xsi="http://www.w3.org/2001/XMLSchema-instance" xmlns:pc="http://schemas.microsoft.com/office/infopath/2007/PartnerControls">
   <documentManagement/>
@@ -25667,14 +25748,6 @@
 </file>
 
 <file path=customXml/itemProps1.xml><?xml version="1.0" encoding="utf-8"?>
-<ds:datastoreItem xmlns:ds="http://schemas.openxmlformats.org/officeDocument/2006/customXml" ds:itemID="{F6194C16-5FE5-4670-BEC8-3D6DD9380312}">
-  <ds:schemaRefs>
-    <ds:schemaRef ds:uri="http://schemas.microsoft.com/sharepoint/v3/contenttype/forms"/>
-  </ds:schemaRefs>
-</ds:datastoreItem>
-</file>
-
-<file path=customXml/itemProps2.xml><?xml version="1.0" encoding="utf-8"?>
 <ds:datastoreItem xmlns:ds="http://schemas.openxmlformats.org/officeDocument/2006/customXml" ds:itemID="{5C3A06EC-DC03-4D65-AA15-C6B9D68C1ED0}">
   <ds:schemaRefs>
     <ds:schemaRef ds:uri="http://schemas.microsoft.com/office/2006/metadata/contentType"/>
@@ -25692,6 +25765,14 @@
 </ds:datastoreItem>
 </file>
 
+<file path=customXml/itemProps2.xml><?xml version="1.0" encoding="utf-8"?>
+<ds:datastoreItem xmlns:ds="http://schemas.openxmlformats.org/officeDocument/2006/customXml" ds:itemID="{F6194C16-5FE5-4670-BEC8-3D6DD9380312}">
+  <ds:schemaRefs>
+    <ds:schemaRef ds:uri="http://schemas.microsoft.com/sharepoint/v3/contenttype/forms"/>
+  </ds:schemaRefs>
+</ds:datastoreItem>
+</file>
+
 <file path=customXml/itemProps3.xml><?xml version="1.0" encoding="utf-8"?>
 <ds:datastoreItem xmlns:ds="http://schemas.openxmlformats.org/officeDocument/2006/customXml" ds:itemID="{2C36E056-BA2C-4A1F-9580-242C9B36FE70}">
   <ds:schemaRefs>

</xml_diff>

<commit_message>
Correction des controleurs et vues
Correction des controlleur, vue
</commit_message>
<xml_diff>
--- a/S04_Lab_Instructions.docx
+++ b/S04_Lab_Instructions.docx
@@ -11638,14 +11638,35 @@
         <w:rPr>
           <w:b/>
           <w:bCs/>
+          <w:sz w:val="260"/>
+          <w:szCs w:val="260"/>
         </w:rPr>
       </w:pPr>
       <w:r>
         <w:rPr>
           <w:b/>
           <w:bCs/>
+          <w:sz w:val="260"/>
+          <w:szCs w:val="260"/>
         </w:rPr>
         <w:lastRenderedPageBreak/>
+        <w:t>ICITTE</w:t>
+      </w:r>
+    </w:p>
+    <w:p>
+      <w:pPr>
+        <w:pStyle w:val="Paragraphedeliste"/>
+        <w:ind w:left="0" w:firstLine="360"/>
+        <w:rPr>
+          <w:b/>
+          <w:bCs/>
+        </w:rPr>
+      </w:pPr>
+      <w:r>
+        <w:rPr>
+          <w:b/>
+          <w:bCs/>
+        </w:rPr>
         <w:t>Zombie</w:t>
       </w:r>
       <w:r>
@@ -25733,18 +25754,18 @@
 </file>
 
 <file path=customXml/item2.xml><?xml version="1.0" encoding="utf-8"?>
+<p:properties xmlns:p="http://schemas.microsoft.com/office/2006/metadata/properties" xmlns:xsi="http://www.w3.org/2001/XMLSchema-instance" xmlns:pc="http://schemas.microsoft.com/office/infopath/2007/PartnerControls">
+  <documentManagement/>
+</p:properties>
+</file>
+
+<file path=customXml/item3.xml><?xml version="1.0" encoding="utf-8"?>
 <?mso-contentType ?>
 <FormTemplates xmlns="http://schemas.microsoft.com/sharepoint/v3/contenttype/forms">
   <Display>DocumentLibraryForm</Display>
   <Edit>DocumentLibraryForm</Edit>
   <New>DocumentLibraryForm</New>
 </FormTemplates>
-</file>
-
-<file path=customXml/item3.xml><?xml version="1.0" encoding="utf-8"?>
-<p:properties xmlns:p="http://schemas.microsoft.com/office/2006/metadata/properties" xmlns:xsi="http://www.w3.org/2001/XMLSchema-instance" xmlns:pc="http://schemas.microsoft.com/office/infopath/2007/PartnerControls">
-  <documentManagement/>
-</p:properties>
 </file>
 
 <file path=customXml/itemProps1.xml><?xml version="1.0" encoding="utf-8"?>
@@ -25766,18 +25787,18 @@
 </file>
 
 <file path=customXml/itemProps2.xml><?xml version="1.0" encoding="utf-8"?>
-<ds:datastoreItem xmlns:ds="http://schemas.openxmlformats.org/officeDocument/2006/customXml" ds:itemID="{F6194C16-5FE5-4670-BEC8-3D6DD9380312}">
-  <ds:schemaRefs>
-    <ds:schemaRef ds:uri="http://schemas.microsoft.com/sharepoint/v3/contenttype/forms"/>
-  </ds:schemaRefs>
-</ds:datastoreItem>
-</file>
-
-<file path=customXml/itemProps3.xml><?xml version="1.0" encoding="utf-8"?>
 <ds:datastoreItem xmlns:ds="http://schemas.openxmlformats.org/officeDocument/2006/customXml" ds:itemID="{2C36E056-BA2C-4A1F-9580-242C9B36FE70}">
   <ds:schemaRefs>
     <ds:schemaRef ds:uri="http://schemas.microsoft.com/office/2006/metadata/properties"/>
     <ds:schemaRef ds:uri="http://schemas.microsoft.com/office/infopath/2007/PartnerControls"/>
   </ds:schemaRefs>
 </ds:datastoreItem>
+</file>
+
+<file path=customXml/itemProps3.xml><?xml version="1.0" encoding="utf-8"?>
+<ds:datastoreItem xmlns:ds="http://schemas.openxmlformats.org/officeDocument/2006/customXml" ds:itemID="{F6194C16-5FE5-4670-BEC8-3D6DD9380312}">
+  <ds:schemaRefs>
+    <ds:schemaRef ds:uri="http://schemas.microsoft.com/sharepoint/v3/contenttype/forms"/>
+  </ds:schemaRefs>
+</ds:datastoreItem>
 </file>
</xml_diff>